<commit_message>
Add RQ3 design intervention (Study 2) + norming SOP/gold key for annotation
- methods_results_skeleton.docx: new Study 2 section — a Mechanism-Gap Report
  (correct conclusion + the specific flawed mechanism the defense exposed + quote
  + what-to-reteach) vs a plain mastery score, in a within-subject controlled
  study on the existing 106 episodes (no redeployment), testing whether it changes
  teachers' identification of hollow-but-MC-passing students and their
  instructional targeting; subject moderation ties RQ2<->RQ3. Lifts the validity
  audit into an artifact + empirical HCI contribution.
- gen_validity_packets.py: each packet now ships 编码手册 + 评分SOP + 对齐练习(8) +
  标注表; emits deliverables/norming_goldkey.md (facilitator) — 8 real norming
  episodes with gold MC-view + defense-depth labels and boundary-teaching notes
  so the 9 teachers can calibrate to kappa>=0.6 before annotating.
</commit_message>
<xml_diff>
--- a/backend/exports/yandaojie/deliverables/methods_results_skeleton.docx
+++ b/backend/exports/yandaojie/deliverables/methods_results_skeleton.docx
@@ -458,7 +458,7 @@
                 <w:sz w:val="19"/>
                 <w:szCs w:val="19"/>
               </w:rPr>
-              <w:t xml:space="preserve">RQ3 设计闭环</w:t>
+              <w:t xml:space="preserve">RQ3 设计干预</w:t>
             </w:r>
           </w:p>
         </w:tc>
@@ -487,7 +487,7 @@
                 <w:sz w:val="19"/>
                 <w:szCs w:val="19"/>
               </w:rPr>
-              <w:t xml:space="preserve">由此得到什么设计知识——何时/如何部署辩护式评估，如何把暴露的“机制缺口”呈现给师生？</w:t>
+              <w:t xml:space="preserve">一个把暴露的“机制缺口”呈现给教师的表征，能否改变其诊断决策与教学针对性？（Study 2 受控实验）</w:t>
             </w:r>
           </w:p>
         </w:tc>
@@ -516,7 +516,7 @@
                 <w:sz w:val="19"/>
                 <w:szCs w:val="19"/>
               </w:rPr>
-              <w:t xml:space="preserve">设计/启示</w:t>
+              <w:t xml:space="preserve">设计+实证</w:t>
             </w:r>
           </w:p>
         </w:tc>
@@ -1881,7 +1881,7 @@
         <w:pStyle w:val="Heading3"/>
       </w:pPr>
       <w:r>
-        <w:t xml:space="preserve">4.3 [RQ3] 设计闭环</w:t>
+        <w:t xml:space="preserve">4.3 [RQ3] 设计干预结果（详见第 5 节 Study 2）</w:t>
       </w:r>
     </w:p>
     <w:p>
@@ -1897,7 +1897,7 @@
           <w:sz w:val="21"/>
           <w:szCs w:val="21"/>
         </w:rPr>
-        <w:t xml:space="preserve">设计启示（占位）：(a) 在概念学科优先部署；(b) 把“对标签、错机制”的具体证据呈现给老师/学生的界面；(c) 让 AI 识别“该 deepen vs 该停”的策略，避免对薄输入过度追问/过度推断。可选：一个轻量设计探针 + 形成性评测。</w:t>
+        <w:t xml:space="preserve">机制缺口报告 vs 仅掌握分：教师正确识别“MC 会放行的空洞学生”的准确率 [__] vs [__]；下一步教学的机制针对性 [__]；增益集中在概念科、语言科≈0（与 4.2 呼应）。</w:t>
       </w:r>
     </w:p>
     <w:p>
@@ -1925,11 +1925,795 @@
       </w:r>
     </w:p>
     <w:p>
+      <w:r>
+        <w:br w:type="page"/>
+      </w:r>
+    </w:p>
+    <w:p>
       <w:pPr>
         <w:pStyle w:val="Heading1"/>
       </w:pPr>
       <w:r>
-        <w:t xml:space="preserve">5. 效度威胁与局限（Threats）</w:t>
+        <w:t xml:space="preserve">5. Study 2（RQ3）：机制缺口报告 — 把发现变成设计</w:t>
+      </w:r>
+    </w:p>
+    <w:p>
+      <w:pPr>
+        <w:spacing w:after="120" w:before="0"/>
+      </w:pPr>
+      <w:r>
+        <w:rPr>
+          <w:b w:val="false"/>
+          <w:bCs w:val="false"/>
+          <w:i w:val="false"/>
+          <w:iCs w:val="false"/>
+          <w:sz w:val="22"/>
+          <w:szCs w:val="22"/>
+        </w:rPr>
+        <w:t xml:space="preserve">Study 1 量化了“效度缺口”（measurement）。Study 2 检验一个把该缺口变得可操作的设计是否改变教师的诊断决策——这一步是把效度审计抬成 HCI 设计贡献的关键。</w:t>
+      </w:r>
+    </w:p>
+    <w:p>
+      <w:pPr>
+        <w:pStyle w:val="Heading2"/>
+      </w:pPr>
+      <w:r>
+        <w:t xml:space="preserve">5.1 干预：机制缺口报告（Mechanism-Gap Report）</w:t>
+      </w:r>
+    </w:p>
+    <w:p>
+      <w:pPr>
+        <w:spacing w:after="60" w:before="0"/>
+      </w:pPr>
+      <w:r>
+        <w:rPr>
+          <w:b w:val="false"/>
+          <w:bCs w:val="false"/>
+          <w:i w:val="false"/>
+          <w:iCs w:val="false"/>
+          <w:sz w:val="22"/>
+          <w:szCs w:val="22"/>
+        </w:rPr>
+        <w:t xml:space="preserve">从一次辩护 episode 自动生成两种教师可见的表征，做对照：</w:t>
+      </w:r>
+    </w:p>
+    <w:tbl>
+      <w:tblPr>
+        <w:tblW w:type="dxa" w:w="9360"/>
+        <w:tblBorders>
+          <w:top w:val="single" w:color="auto" w:sz="4"/>
+          <w:left w:val="single" w:color="auto" w:sz="4"/>
+          <w:bottom w:val="single" w:color="auto" w:sz="4"/>
+          <w:right w:val="single" w:color="auto" w:sz="4"/>
+          <w:insideH w:val="single" w:color="auto" w:sz="4"/>
+          <w:insideV w:val="single" w:color="auto" w:sz="4"/>
+        </w:tblBorders>
+      </w:tblPr>
+      <w:tblGrid>
+        <w:gridCol w:w="2600"/>
+        <w:gridCol w:w="6760"/>
+      </w:tblGrid>
+      <w:tr>
+        <w:trPr>
+          <w:tblHeader/>
+        </w:trPr>
+        <w:tc>
+          <w:tcPr>
+            <w:tcW w:type="dxa" w:w="2600"/>
+            <w:tcBorders>
+              <w:top w:val="single" w:color="BFBFBF" w:sz="4"/>
+              <w:left w:val="single" w:color="BFBFBF" w:sz="4"/>
+              <w:bottom w:val="single" w:color="BFBFBF" w:sz="4"/>
+              <w:right w:val="single" w:color="BFBFBF" w:sz="4"/>
+            </w:tcBorders>
+            <w:shd w:fill="1F3864" w:val="clear"/>
+            <w:tcMar>
+              <w:top w:type="dxa" w:w="50"/>
+              <w:left w:type="dxa" w:w="100"/>
+              <w:bottom w:type="dxa" w:w="50"/>
+              <w:right w:type="dxa" w:w="100"/>
+            </w:tcMar>
+          </w:tcPr>
+          <w:p>
+            <w:pPr>
+              <w:spacing w:after="0"/>
+            </w:pPr>
+            <w:r>
+              <w:rPr>
+                <w:b/>
+                <w:bCs/>
+                <w:color w:val="FFFFFF"/>
+                <w:sz w:val="19"/>
+                <w:szCs w:val="19"/>
+              </w:rPr>
+              <w:t xml:space="preserve">条件</w:t>
+            </w:r>
+          </w:p>
+        </w:tc>
+        <w:tc>
+          <w:tcPr>
+            <w:tcW w:type="dxa" w:w="6760"/>
+            <w:tcBorders>
+              <w:top w:val="single" w:color="BFBFBF" w:sz="4"/>
+              <w:left w:val="single" w:color="BFBFBF" w:sz="4"/>
+              <w:bottom w:val="single" w:color="BFBFBF" w:sz="4"/>
+              <w:right w:val="single" w:color="BFBFBF" w:sz="4"/>
+            </w:tcBorders>
+            <w:shd w:fill="1F3864" w:val="clear"/>
+            <w:tcMar>
+              <w:top w:type="dxa" w:w="50"/>
+              <w:left w:type="dxa" w:w="100"/>
+              <w:bottom w:type="dxa" w:w="50"/>
+              <w:right w:type="dxa" w:w="100"/>
+            </w:tcMar>
+          </w:tcPr>
+          <w:p>
+            <w:pPr>
+              <w:spacing w:after="0"/>
+            </w:pPr>
+            <w:r>
+              <w:rPr>
+                <w:b/>
+                <w:bCs/>
+                <w:color w:val="FFFFFF"/>
+                <w:sz w:val="19"/>
+                <w:szCs w:val="19"/>
+              </w:rPr>
+              <w:t xml:space="preserve">教师看到的内容</w:t>
+            </w:r>
+          </w:p>
+        </w:tc>
+      </w:tr>
+      <w:tr>
+        <w:tc>
+          <w:tcPr>
+            <w:tcW w:type="dxa" w:w="2600"/>
+            <w:tcBorders>
+              <w:top w:val="single" w:color="BFBFBF" w:sz="4"/>
+              <w:left w:val="single" w:color="BFBFBF" w:sz="4"/>
+              <w:bottom w:val="single" w:color="BFBFBF" w:sz="4"/>
+              <w:right w:val="single" w:color="BFBFBF" w:sz="4"/>
+            </w:tcBorders>
+            <w:tcMar>
+              <w:top w:type="dxa" w:w="50"/>
+              <w:left w:type="dxa" w:w="100"/>
+              <w:bottom w:type="dxa" w:w="50"/>
+              <w:right w:type="dxa" w:w="100"/>
+            </w:tcMar>
+          </w:tcPr>
+          <w:p>
+            <w:pPr>
+              <w:spacing w:after="0"/>
+            </w:pPr>
+            <w:r>
+              <w:rPr>
+                <w:sz w:val="19"/>
+                <w:szCs w:val="19"/>
+              </w:rPr>
+              <w:t xml:space="preserve">基线（仅掌握分）</w:t>
+            </w:r>
+          </w:p>
+        </w:tc>
+        <w:tc>
+          <w:tcPr>
+            <w:tcW w:type="dxa" w:w="6760"/>
+            <w:tcBorders>
+              <w:top w:val="single" w:color="BFBFBF" w:sz="4"/>
+              <w:left w:val="single" w:color="BFBFBF" w:sz="4"/>
+              <w:bottom w:val="single" w:color="BFBFBF" w:sz="4"/>
+              <w:right w:val="single" w:color="BFBFBF" w:sz="4"/>
+            </w:tcBorders>
+            <w:tcMar>
+              <w:top w:type="dxa" w:w="50"/>
+              <w:left w:type="dxa" w:w="100"/>
+              <w:bottom w:type="dxa" w:w="50"/>
+              <w:right w:type="dxa" w:w="100"/>
+            </w:tcMar>
+          </w:tcPr>
+          <w:p>
+            <w:pPr>
+              <w:spacing w:after="0"/>
+            </w:pPr>
+            <w:r>
+              <w:rPr>
+                <w:sz w:val="19"/>
+                <w:szCs w:val="19"/>
+              </w:rPr>
+              <w:t xml:space="preserve">一个掌握标签/分数（已掌握/部分/未掌握）——即选择题或常规看板给出的东西。</w:t>
+            </w:r>
+          </w:p>
+        </w:tc>
+      </w:tr>
+      <w:tr>
+        <w:tc>
+          <w:tcPr>
+            <w:tcW w:type="dxa" w:w="2600"/>
+            <w:tcBorders>
+              <w:top w:val="single" w:color="BFBFBF" w:sz="4"/>
+              <w:left w:val="single" w:color="BFBFBF" w:sz="4"/>
+              <w:bottom w:val="single" w:color="BFBFBF" w:sz="4"/>
+              <w:right w:val="single" w:color="BFBFBF" w:sz="4"/>
+            </w:tcBorders>
+            <w:tcMar>
+              <w:top w:type="dxa" w:w="50"/>
+              <w:left w:type="dxa" w:w="100"/>
+              <w:bottom w:type="dxa" w:w="50"/>
+              <w:right w:type="dxa" w:w="100"/>
+            </w:tcMar>
+          </w:tcPr>
+          <w:p>
+            <w:pPr>
+              <w:spacing w:after="0"/>
+            </w:pPr>
+            <w:r>
+              <w:rPr>
+                <w:b/>
+                <w:bCs/>
+                <w:sz w:val="19"/>
+                <w:szCs w:val="19"/>
+              </w:rPr>
+              <w:t xml:space="preserve">处理（机制缺口卡）</w:t>
+            </w:r>
+          </w:p>
+        </w:tc>
+        <w:tc>
+          <w:tcPr>
+            <w:tcW w:type="dxa" w:w="6760"/>
+            <w:tcBorders>
+              <w:top w:val="single" w:color="BFBFBF" w:sz="4"/>
+              <w:left w:val="single" w:color="BFBFBF" w:sz="4"/>
+              <w:bottom w:val="single" w:color="BFBFBF" w:sz="4"/>
+              <w:right w:val="single" w:color="BFBFBF" w:sz="4"/>
+            </w:tcBorders>
+            <w:tcMar>
+              <w:top w:type="dxa" w:w="50"/>
+              <w:left w:type="dxa" w:w="100"/>
+              <w:bottom w:type="dxa" w:w="50"/>
+              <w:right w:type="dxa" w:w="100"/>
+            </w:tcMar>
+          </w:tcPr>
+          <w:p>
+            <w:pPr>
+              <w:spacing w:after="0"/>
+            </w:pPr>
+            <w:r>
+              <w:rPr>
+                <w:sz w:val="19"/>
+                <w:szCs w:val="19"/>
+              </w:rPr>
+              <w:t xml:space="preserve">学生得到的（正确）结论 ＋ 辩护中暴露的**具体错误机制** ＋ 学生原话引用 ＋ 一句“该重教什么”。（由 Study 1 的辩护深度标注自动生成）</w:t>
+            </w:r>
+          </w:p>
+        </w:tc>
+      </w:tr>
+    </w:tbl>
+    <w:p>
+      <w:pPr>
+        <w:pStyle w:val="Heading2"/>
+      </w:pPr>
+      <w:r>
+        <w:t xml:space="preserve">5.2 设计 Design</w:t>
+      </w:r>
+    </w:p>
+    <w:p>
+      <w:pPr>
+        <w:pStyle w:val="ListParagraph"/>
+        <w:numPr>
+          <w:ilvl w:val="0"/>
+          <w:numId w:val="2"/>
+        </w:numPr>
+        <w:spacing w:after="60"/>
+      </w:pPr>
+      <w:r>
+        <w:rPr>
+          <w:sz w:val="22"/>
+          <w:szCs w:val="22"/>
+        </w:rPr>
+        <w:t xml:space="preserve">被试内：每位教师对一组 episode 在两种表征条件下做判断，条件随机配平。</w:t>
+      </w:r>
+    </w:p>
+    <w:p>
+      <w:pPr>
+        <w:pStyle w:val="ListParagraph"/>
+        <w:numPr>
+          <w:ilvl w:val="0"/>
+          <w:numId w:val="2"/>
+        </w:numPr>
+        <w:spacing w:after="60"/>
+      </w:pPr>
+      <w:r>
+        <w:rPr>
+          <w:sz w:val="22"/>
+          <w:szCs w:val="22"/>
+        </w:rPr>
+        <w:t xml:space="preserve">刺激 = Study 1 的 106 个真实 episode（混合 扎实/对标签错机制/空洞），**无需重新部署系统**。</w:t>
+      </w:r>
+    </w:p>
+    <w:p>
+      <w:pPr>
+        <w:pStyle w:val="ListParagraph"/>
+        <w:numPr>
+          <w:ilvl w:val="0"/>
+          <w:numId w:val="2"/>
+        </w:numPr>
+        <w:spacing w:after="60"/>
+      </w:pPr>
+      <w:r>
+        <w:rPr>
+          <w:sz w:val="22"/>
+          <w:szCs w:val="22"/>
+        </w:rPr>
+        <w:t xml:space="preserve">这是一个快速评分任务 → 可在 9 位本学科教师之外**扩招更大教师样本**以补功效（解决 Study 1 的 n 限制）。</w:t>
+      </w:r>
+    </w:p>
+    <w:p>
+      <w:pPr>
+        <w:pStyle w:val="ListParagraph"/>
+        <w:numPr>
+          <w:ilvl w:val="0"/>
+          <w:numId w:val="2"/>
+        </w:numPr>
+        <w:spacing w:after="60"/>
+      </w:pPr>
+      <w:r>
+        <w:rPr>
+          <w:sz w:val="22"/>
+          <w:szCs w:val="22"/>
+        </w:rPr>
+        <w:t xml:space="preserve">“真值” = Study 1 教师 panel 的辩护深度标注（谁真的空洞/扎实）。</w:t>
+      </w:r>
+    </w:p>
+    <w:p>
+      <w:pPr>
+        <w:pStyle w:val="Heading2"/>
+      </w:pPr>
+      <w:r>
+        <w:t xml:space="preserve">5.3 任务、测量与假设</w:t>
+      </w:r>
+    </w:p>
+    <w:p>
+      <w:pPr>
+        <w:spacing w:after="60" w:before="0"/>
+      </w:pPr>
+      <w:r>
+        <w:rPr>
+          <w:b w:val="false"/>
+          <w:bCs w:val="false"/>
+          <w:i w:val="false"/>
+          <w:iCs w:val="false"/>
+          <w:sz w:val="22"/>
+          <w:szCs w:val="22"/>
+        </w:rPr>
+        <w:t xml:space="preserve">每个 episode：教师据该表征 (a) 判断学生是否真懂；(b) 选择/写出下一步教学；(c) 报信心。</w:t>
+      </w:r>
+    </w:p>
+    <w:tbl>
+      <w:tblPr>
+        <w:tblW w:type="dxa" w:w="9360"/>
+        <w:tblBorders>
+          <w:top w:val="single" w:color="auto" w:sz="4"/>
+          <w:left w:val="single" w:color="auto" w:sz="4"/>
+          <w:bottom w:val="single" w:color="auto" w:sz="4"/>
+          <w:right w:val="single" w:color="auto" w:sz="4"/>
+          <w:insideH w:val="single" w:color="auto" w:sz="4"/>
+          <w:insideV w:val="single" w:color="auto" w:sz="4"/>
+        </w:tblBorders>
+      </w:tblPr>
+      <w:tblGrid>
+        <w:gridCol w:w="4200"/>
+        <w:gridCol w:w="5160"/>
+      </w:tblGrid>
+      <w:tr>
+        <w:trPr>
+          <w:tblHeader/>
+        </w:trPr>
+        <w:tc>
+          <w:tcPr>
+            <w:tcW w:type="dxa" w:w="4200"/>
+            <w:tcBorders>
+              <w:top w:val="single" w:color="BFBFBF" w:sz="4"/>
+              <w:left w:val="single" w:color="BFBFBF" w:sz="4"/>
+              <w:bottom w:val="single" w:color="BFBFBF" w:sz="4"/>
+              <w:right w:val="single" w:color="BFBFBF" w:sz="4"/>
+            </w:tcBorders>
+            <w:shd w:fill="1F3864" w:val="clear"/>
+            <w:tcMar>
+              <w:top w:type="dxa" w:w="50"/>
+              <w:left w:type="dxa" w:w="100"/>
+              <w:bottom w:type="dxa" w:w="50"/>
+              <w:right w:type="dxa" w:w="100"/>
+            </w:tcMar>
+          </w:tcPr>
+          <w:p>
+            <w:pPr>
+              <w:spacing w:after="0"/>
+            </w:pPr>
+            <w:r>
+              <w:rPr>
+                <w:b/>
+                <w:bCs/>
+                <w:color w:val="FFFFFF"/>
+                <w:sz w:val="19"/>
+                <w:szCs w:val="19"/>
+              </w:rPr>
+              <w:t xml:space="preserve">测量</w:t>
+            </w:r>
+          </w:p>
+        </w:tc>
+        <w:tc>
+          <w:tcPr>
+            <w:tcW w:type="dxa" w:w="5160"/>
+            <w:tcBorders>
+              <w:top w:val="single" w:color="BFBFBF" w:sz="4"/>
+              <w:left w:val="single" w:color="BFBFBF" w:sz="4"/>
+              <w:bottom w:val="single" w:color="BFBFBF" w:sz="4"/>
+              <w:right w:val="single" w:color="BFBFBF" w:sz="4"/>
+            </w:tcBorders>
+            <w:shd w:fill="1F3864" w:val="clear"/>
+            <w:tcMar>
+              <w:top w:type="dxa" w:w="50"/>
+              <w:left w:type="dxa" w:w="100"/>
+              <w:bottom w:type="dxa" w:w="50"/>
+              <w:right w:type="dxa" w:w="100"/>
+            </w:tcMar>
+          </w:tcPr>
+          <w:p>
+            <w:pPr>
+              <w:spacing w:after="0"/>
+            </w:pPr>
+            <w:r>
+              <w:rPr>
+                <w:b/>
+                <w:bCs/>
+                <w:color w:val="FFFFFF"/>
+                <w:sz w:val="19"/>
+                <w:szCs w:val="19"/>
+              </w:rPr>
+              <w:t xml:space="preserve">假设</w:t>
+            </w:r>
+          </w:p>
+        </w:tc>
+      </w:tr>
+      <w:tr>
+        <w:tc>
+          <w:tcPr>
+            <w:tcW w:type="dxa" w:w="4200"/>
+            <w:tcBorders>
+              <w:top w:val="single" w:color="BFBFBF" w:sz="4"/>
+              <w:left w:val="single" w:color="BFBFBF" w:sz="4"/>
+              <w:bottom w:val="single" w:color="BFBFBF" w:sz="4"/>
+              <w:right w:val="single" w:color="BFBFBF" w:sz="4"/>
+            </w:tcBorders>
+            <w:tcMar>
+              <w:top w:type="dxa" w:w="50"/>
+              <w:left w:type="dxa" w:w="100"/>
+              <w:bottom w:type="dxa" w:w="50"/>
+              <w:right w:type="dxa" w:w="100"/>
+            </w:tcMar>
+          </w:tcPr>
+          <w:p>
+            <w:pPr>
+              <w:spacing w:after="0"/>
+            </w:pPr>
+            <w:r>
+              <w:rPr>
+                <w:sz w:val="19"/>
+                <w:szCs w:val="19"/>
+              </w:rPr>
+              <w:t xml:space="preserve">识别“空洞但 MC 会放行”学生的准确率(敏感度)</w:t>
+            </w:r>
+          </w:p>
+        </w:tc>
+        <w:tc>
+          <w:tcPr>
+            <w:tcW w:type="dxa" w:w="5160"/>
+            <w:tcBorders>
+              <w:top w:val="single" w:color="BFBFBF" w:sz="4"/>
+              <w:left w:val="single" w:color="BFBFBF" w:sz="4"/>
+              <w:bottom w:val="single" w:color="BFBFBF" w:sz="4"/>
+              <w:right w:val="single" w:color="BFBFBF" w:sz="4"/>
+            </w:tcBorders>
+            <w:tcMar>
+              <w:top w:type="dxa" w:w="50"/>
+              <w:left w:type="dxa" w:w="100"/>
+              <w:bottom w:type="dxa" w:w="50"/>
+              <w:right w:type="dxa" w:w="100"/>
+            </w:tcMar>
+          </w:tcPr>
+          <w:p>
+            <w:pPr>
+              <w:spacing w:after="0"/>
+            </w:pPr>
+            <w:r>
+              <w:rPr>
+                <w:sz w:val="19"/>
+                <w:szCs w:val="19"/>
+              </w:rPr>
+              <w:t xml:space="preserve">H1：机制缺口报告 ↑ 正确识别（vs 仅掌握分）</w:t>
+            </w:r>
+          </w:p>
+        </w:tc>
+      </w:tr>
+      <w:tr>
+        <w:tc>
+          <w:tcPr>
+            <w:tcW w:type="dxa" w:w="4200"/>
+            <w:tcBorders>
+              <w:top w:val="single" w:color="BFBFBF" w:sz="4"/>
+              <w:left w:val="single" w:color="BFBFBF" w:sz="4"/>
+              <w:bottom w:val="single" w:color="BFBFBF" w:sz="4"/>
+              <w:right w:val="single" w:color="BFBFBF" w:sz="4"/>
+            </w:tcBorders>
+            <w:tcMar>
+              <w:top w:type="dxa" w:w="50"/>
+              <w:left w:type="dxa" w:w="100"/>
+              <w:bottom w:type="dxa" w:w="50"/>
+              <w:right w:type="dxa" w:w="100"/>
+            </w:tcMar>
+          </w:tcPr>
+          <w:p>
+            <w:pPr>
+              <w:spacing w:after="0"/>
+            </w:pPr>
+            <w:r>
+              <w:rPr>
+                <w:sz w:val="19"/>
+                <w:szCs w:val="19"/>
+              </w:rPr>
+              <w:t xml:space="preserve">下一步教学的机制针对性（编码 generic vs 机制定向）</w:t>
+            </w:r>
+          </w:p>
+        </w:tc>
+        <w:tc>
+          <w:tcPr>
+            <w:tcW w:type="dxa" w:w="5160"/>
+            <w:tcBorders>
+              <w:top w:val="single" w:color="BFBFBF" w:sz="4"/>
+              <w:left w:val="single" w:color="BFBFBF" w:sz="4"/>
+              <w:bottom w:val="single" w:color="BFBFBF" w:sz="4"/>
+              <w:right w:val="single" w:color="BFBFBF" w:sz="4"/>
+            </w:tcBorders>
+            <w:tcMar>
+              <w:top w:type="dxa" w:w="50"/>
+              <w:left w:type="dxa" w:w="100"/>
+              <w:bottom w:type="dxa" w:w="50"/>
+              <w:right w:type="dxa" w:w="100"/>
+            </w:tcMar>
+          </w:tcPr>
+          <w:p>
+            <w:pPr>
+              <w:spacing w:after="0"/>
+            </w:pPr>
+            <w:r>
+              <w:rPr>
+                <w:sz w:val="19"/>
+                <w:szCs w:val="19"/>
+              </w:rPr>
+              <w:t xml:space="preserve">H2：报告 ↑ 针对性教学</w:t>
+            </w:r>
+          </w:p>
+        </w:tc>
+      </w:tr>
+      <w:tr>
+        <w:tc>
+          <w:tcPr>
+            <w:tcW w:type="dxa" w:w="4200"/>
+            <w:tcBorders>
+              <w:top w:val="single" w:color="BFBFBF" w:sz="4"/>
+              <w:left w:val="single" w:color="BFBFBF" w:sz="4"/>
+              <w:bottom w:val="single" w:color="BFBFBF" w:sz="4"/>
+              <w:right w:val="single" w:color="BFBFBF" w:sz="4"/>
+            </w:tcBorders>
+            <w:tcMar>
+              <w:top w:type="dxa" w:w="50"/>
+              <w:left w:type="dxa" w:w="100"/>
+              <w:bottom w:type="dxa" w:w="50"/>
+              <w:right w:type="dxa" w:w="100"/>
+            </w:tcMar>
+          </w:tcPr>
+          <w:p>
+            <w:pPr>
+              <w:spacing w:after="0"/>
+            </w:pPr>
+            <w:r>
+              <w:rPr>
+                <w:sz w:val="19"/>
+                <w:szCs w:val="19"/>
+              </w:rPr>
+              <w:t xml:space="preserve">信心校准（信心 vs 正确）</w:t>
+            </w:r>
+          </w:p>
+        </w:tc>
+        <w:tc>
+          <w:tcPr>
+            <w:tcW w:type="dxa" w:w="5160"/>
+            <w:tcBorders>
+              <w:top w:val="single" w:color="BFBFBF" w:sz="4"/>
+              <w:left w:val="single" w:color="BFBFBF" w:sz="4"/>
+              <w:bottom w:val="single" w:color="BFBFBF" w:sz="4"/>
+              <w:right w:val="single" w:color="BFBFBF" w:sz="4"/>
+            </w:tcBorders>
+            <w:tcMar>
+              <w:top w:type="dxa" w:w="50"/>
+              <w:left w:type="dxa" w:w="100"/>
+              <w:bottom w:type="dxa" w:w="50"/>
+              <w:right w:type="dxa" w:w="100"/>
+            </w:tcMar>
+          </w:tcPr>
+          <w:p>
+            <w:pPr>
+              <w:spacing w:after="0"/>
+            </w:pPr>
+            <w:r>
+              <w:rPr>
+                <w:sz w:val="19"/>
+                <w:szCs w:val="19"/>
+              </w:rPr>
+              <w:t xml:space="preserve">H4：仅掌握分使信心虚高而不更准；报告更校准</w:t>
+            </w:r>
+          </w:p>
+        </w:tc>
+      </w:tr>
+      <w:tr>
+        <w:tc>
+          <w:tcPr>
+            <w:tcW w:type="dxa" w:w="4200"/>
+            <w:tcBorders>
+              <w:top w:val="single" w:color="BFBFBF" w:sz="4"/>
+              <w:left w:val="single" w:color="BFBFBF" w:sz="4"/>
+              <w:bottom w:val="single" w:color="BFBFBF" w:sz="4"/>
+              <w:right w:val="single" w:color="BFBFBF" w:sz="4"/>
+            </w:tcBorders>
+            <w:tcMar>
+              <w:top w:type="dxa" w:w="50"/>
+              <w:left w:type="dxa" w:w="100"/>
+              <w:bottom w:type="dxa" w:w="50"/>
+              <w:right w:type="dxa" w:w="100"/>
+            </w:tcMar>
+          </w:tcPr>
+          <w:p>
+            <w:pPr>
+              <w:spacing w:after="0"/>
+            </w:pPr>
+            <w:r>
+              <w:rPr>
+                <w:sz w:val="19"/>
+                <w:szCs w:val="19"/>
+              </w:rPr>
+              <w:t xml:space="preserve">学科调节</w:t>
+            </w:r>
+          </w:p>
+        </w:tc>
+        <w:tc>
+          <w:tcPr>
+            <w:tcW w:type="dxa" w:w="5160"/>
+            <w:tcBorders>
+              <w:top w:val="single" w:color="BFBFBF" w:sz="4"/>
+              <w:left w:val="single" w:color="BFBFBF" w:sz="4"/>
+              <w:bottom w:val="single" w:color="BFBFBF" w:sz="4"/>
+              <w:right w:val="single" w:color="BFBFBF" w:sz="4"/>
+            </w:tcBorders>
+            <w:tcMar>
+              <w:top w:type="dxa" w:w="50"/>
+              <w:left w:type="dxa" w:w="100"/>
+              <w:bottom w:type="dxa" w:w="50"/>
+              <w:right w:type="dxa" w:w="100"/>
+            </w:tcMar>
+          </w:tcPr>
+          <w:p>
+            <w:pPr>
+              <w:spacing w:after="0"/>
+            </w:pPr>
+            <w:r>
+              <w:rPr>
+                <w:sz w:val="19"/>
+                <w:szCs w:val="19"/>
+              </w:rPr>
+              <w:t xml:space="preserve">H3：增益集中在概念科（数学/科学），语言科≈0 —— 与 RQ2/4.2 呼应，把两条 RQ 缝起来</w:t>
+            </w:r>
+          </w:p>
+        </w:tc>
+      </w:tr>
+    </w:tbl>
+    <w:p>
+      <w:pPr>
+        <w:spacing w:after="100" w:before="60"/>
+      </w:pPr>
+      <w:r>
+        <w:rPr>
+          <w:b w:val="false"/>
+          <w:bCs w:val="false"/>
+          <w:i/>
+          <w:iCs/>
+          <w:color w:val="555555"/>
+          <w:sz w:val="22"/>
+          <w:szCs w:val="22"/>
+        </w:rPr>
+        <w:t xml:space="preserve">分析：混合效应（教师 + episode 随机效应），被试内对比，报效应量 + CI 与学科调节。</w:t>
+      </w:r>
+    </w:p>
+    <w:p>
+      <w:pPr>
+        <w:pStyle w:val="Heading2"/>
+      </w:pPr>
+      <w:r>
+        <w:t xml:space="preserve">5.4 贡献（为何这把论文抬成 HCI 贡献）</w:t>
+      </w:r>
+    </w:p>
+    <w:p>
+      <w:pPr>
+        <w:pStyle w:val="ListParagraph"/>
+        <w:numPr>
+          <w:ilvl w:val="0"/>
+          <w:numId w:val="2"/>
+        </w:numPr>
+        <w:spacing w:after="60"/>
+      </w:pPr>
+      <w:r>
+        <w:rPr>
+          <w:sz w:val="22"/>
+          <w:szCs w:val="22"/>
+        </w:rPr>
+        <w:t xml:space="preserve">artifact：把“辩护暴露的机制缺口”做成一种可呈现、可操作的表征。</w:t>
+      </w:r>
+    </w:p>
+    <w:p>
+      <w:pPr>
+        <w:pStyle w:val="ListParagraph"/>
+        <w:numPr>
+          <w:ilvl w:val="0"/>
+          <w:numId w:val="2"/>
+        </w:numPr>
+        <w:spacing w:after="60"/>
+      </w:pPr>
+      <w:r>
+        <w:rPr>
+          <w:sz w:val="22"/>
+          <w:szCs w:val="22"/>
+        </w:rPr>
+        <w:t xml:space="preserve">受控实证：证明该表征**改变专家诊断决策与教学针对性**——不是“我们测了个缺口”，而是“我们设计了让缺口可操作的东西并证明它有用”。</w:t>
+      </w:r>
+    </w:p>
+    <w:p>
+      <w:pPr>
+        <w:pStyle w:val="ListParagraph"/>
+        <w:numPr>
+          <w:ilvl w:val="0"/>
+          <w:numId w:val="2"/>
+        </w:numPr>
+        <w:spacing w:after="60"/>
+      </w:pPr>
+      <w:r>
+        <w:rPr>
+          <w:sz w:val="22"/>
+          <w:szCs w:val="22"/>
+        </w:rPr>
+        <w:t xml:space="preserve">设计知识：哪些表征要素起作用（原话引用？命名误解？重教建议？）——可加组件操纵。</w:t>
+      </w:r>
+    </w:p>
+    <w:p>
+      <w:pPr>
+        <w:spacing w:after="100" w:before="60"/>
+      </w:pPr>
+      <w:r>
+        <w:rPr>
+          <w:b w:val="false"/>
+          <w:bCs w:val="false"/>
+          <w:i/>
+          <w:iCs/>
+          <w:color w:val="555555"/>
+          <w:sz w:val="22"/>
+          <w:szCs w:val="22"/>
+        </w:rPr>
+        <w:t xml:space="preserve">（可选延伸，需新部署）学生面向 / in-loop 版本：让 AI 在循环内把机制缺口回呈给学生以触发重思；本文作为 future work。</w:t>
+      </w:r>
+    </w:p>
+    <w:p>
+      <w:pPr>
+        <w:pStyle w:val="Heading1"/>
+      </w:pPr>
+      <w:r>
+        <w:t xml:space="preserve">6. 效度威胁与局限（Threats）</w:t>
       </w:r>
     </w:p>
     <w:p>

</xml_diff>